<commit_message>
Adjust the car template
</commit_message>
<xml_diff>
--- a/public/template-car.docx
+++ b/public/template-car.docx
@@ -461,13 +461,13 @@
                                 <w:pPr>
                                   <w:pStyle w:val="Heading1"/>
                                   <w:rPr>
-                                    <w:rFonts w:ascii="VNI-Helve-Condense" w:hAnsi="VNI-Helve-Condense"/>
+                                    <w:rFonts w:ascii="Times New Roman" w:hAnsi="Times New Roman"/>
                                     <w:sz w:val="50"/>
                                   </w:rPr>
                                 </w:pPr>
                                 <w:r>
                                   <w:rPr>
-                                    <w:rFonts w:ascii="VNI-Helve-Condense" w:hAnsi="VNI-Helve-Condense"/>
+                                    <w:rFonts w:ascii="Times New Roman" w:hAnsi="Times New Roman"/>
                                     <w:sz w:val="50"/>
                                   </w:rPr>
                                   <w:t>THẺ KIỂM SOÁT</w:t>
@@ -944,13 +944,13 @@
                           <w:pPr>
                             <w:pStyle w:val="Heading1"/>
                             <w:rPr>
-                              <w:rFonts w:ascii="VNI-Helve-Condense" w:hAnsi="VNI-Helve-Condense"/>
+                              <w:rFonts w:ascii="Times New Roman" w:hAnsi="Times New Roman"/>
                               <w:sz w:val="50"/>
                             </w:rPr>
                           </w:pPr>
                           <w:r>
                             <w:rPr>
-                              <w:rFonts w:ascii="VNI-Helve-Condense" w:hAnsi="VNI-Helve-Condense"/>
+                              <w:rFonts w:ascii="Times New Roman" w:hAnsi="Times New Roman"/>
                               <w:sz w:val="50"/>
                             </w:rPr>
                             <w:t>THẺ KIỂM SOÁT</w:t>

</xml_diff>